<commit_message>
Sprouts: interview prep + confirm cash handling and MS Office, rescore to 61 (Solid stretch)
Josh confirmed regular cash handling at Standing Akimbo and hands-on
Outlook/Excel/Word proficiency, closing the two biggest open items on the
Administrative Coordinator match report. Added both to master-profile.md,
updated the tailored resume and match report, rescored 52 -> 61 (Long shot
-> Solid stretch), and wrote sprouts-farmers-market-interview-prep.md
covering the likely question set (why an hourly retail role after 15 years
in SaaS, cash-handling follow-ups, remaining real gaps like grocery POS/
payroll software).

Co-Authored-By: Claude Sonnet 5 <noreply@anthropic.com>
Claude-Session: https://claude.ai/code/session_018PWNMGW6sMNQBQW8r9m5br
</commit_message>
<xml_diff>
--- a/applications/sprouts-farmers-market/Rotenberg Resume - Sprouts Farmers Market - Administrative Coordinator.docx
+++ b/applications/sprouts-farmers-market/Rotenberg Resume - Sprouts Farmers Market - Administrative Coordinator.docx
@@ -633,7 +633,7 @@
           <w:i w:val="0"/>
           <w:color w:val="1A1A1A"/>
         </w:rPr>
-        <w:t>Built compliance and customer-management systems from scratch in a licensed cannabis dispensary.</w:t>
+        <w:t>Personally counted and handled cash, and managed till/drawer and deposit activity, as a routine part of daily operations.</w:t>
       </w:r>
     </w:p>
     <w:p>
@@ -657,7 +657,7 @@
           <w:i w:val="0"/>
           <w:color w:val="1A1A1A"/>
         </w:rPr>
-        <w:t>Developed early operational infrastructure — intake processes and reporting systems — scaling the business to profitability.</w:t>
+        <w:t>Built compliance and customer-management systems from scratch in a licensed cannabis dispensary.</w:t>
       </w:r>
     </w:p>
     <w:p>
@@ -745,7 +745,7 @@
           <w:i w:val="0"/>
           <w:color w:val="1A1A1A"/>
         </w:rPr>
-        <w:t>Performance Reporting, Dashboard Building, Google Apps (Sheets, Docs), Multi-System Documentation</w:t>
+        <w:t>Performance Reporting, Dashboard Building, Microsoft Office (Outlook, Excel, Word), Google Apps (Sheets, Docs), Multi-System Documentation</w:t>
       </w:r>
     </w:p>
     <w:p>

</xml_diff>